<commit_message>
All Final Project files
</commit_message>
<xml_diff>
--- a/ECNS460 Project/Stage 2/Stage 2 Writeup.docx
+++ b/ECNS460 Project/Stage 2/Stage 2 Writeup.docx
@@ -485,30 +485,31 @@
           <w14:ligatures w14:val="none"/>
         </w:rPr>
       </w:pPr>
-      <w:r>
-        <w:rPr>
-          <w:rFonts w:ascii="Aptos" w:eastAsia="Times New Roman" w:hAnsi="Aptos" w:cs="Times New Roman"/>
-          <w:kern w:val="0"/>
-          <w14:ligatures w14:val="none"/>
-        </w:rPr>
-        <w:t xml:space="preserve">This figure provides a baseline context as to where </w:t>
-      </w:r>
-      <w:r>
-        <w:rPr>
-          <w:rFonts w:ascii="Aptos" w:eastAsia="Times New Roman" w:hAnsi="Aptos" w:cs="Times New Roman"/>
-          <w:kern w:val="0"/>
-          <w14:ligatures w14:val="none"/>
-        </w:rPr>
-        <w:t xml:space="preserve">the majority of EVs </w:t>
-      </w:r>
-      <w:proofErr w:type="gramStart"/>
-      <w:r>
-        <w:rPr>
-          <w:rFonts w:ascii="Aptos" w:eastAsia="Times New Roman" w:hAnsi="Aptos" w:cs="Times New Roman"/>
-          <w:kern w:val="0"/>
-          <w14:ligatures w14:val="none"/>
-        </w:rPr>
-        <w:t xml:space="preserve">are </w:t>
+      <w:proofErr w:type="spellStart"/>
+      <w:r>
+        <w:rPr>
+          <w:rFonts w:ascii="Aptos" w:eastAsia="Times New Roman" w:hAnsi="Aptos" w:cs="Times New Roman"/>
+          <w:kern w:val="0"/>
+          <w14:ligatures w14:val="none"/>
+        </w:rPr>
+        <w:t>This figure</w:t>
+      </w:r>
+      <w:proofErr w:type="spellEnd"/>
+      <w:r>
+        <w:rPr>
+          <w:rFonts w:ascii="Aptos" w:eastAsia="Times New Roman" w:hAnsi="Aptos" w:cs="Times New Roman"/>
+          <w:kern w:val="0"/>
+          <w14:ligatures w14:val="none"/>
+        </w:rPr>
+        <w:t xml:space="preserve"> provides a baseline context as to where </w:t>
+      </w:r>
+      <w:r>
+        <w:rPr>
+          <w:rFonts w:ascii="Aptos" w:eastAsia="Times New Roman" w:hAnsi="Aptos" w:cs="Times New Roman"/>
+          <w:kern w:val="0"/>
+          <w14:ligatures w14:val="none"/>
+        </w:rPr>
+        <w:t xml:space="preserve">the majority of EVs are </w:t>
       </w:r>
       <w:r>
         <w:rPr>
@@ -524,16 +525,7 @@
           <w:kern w:val="0"/>
           <w14:ligatures w14:val="none"/>
         </w:rPr>
-        <w:t xml:space="preserve"> in</w:t>
-      </w:r>
-      <w:proofErr w:type="gramEnd"/>
-      <w:r>
-        <w:rPr>
-          <w:rFonts w:ascii="Aptos" w:eastAsia="Times New Roman" w:hAnsi="Aptos" w:cs="Times New Roman"/>
-          <w:kern w:val="0"/>
-          <w14:ligatures w14:val="none"/>
-        </w:rPr>
-        <w:t xml:space="preserve"> each state. We chose a horizontal bar chart so that each state can be compared on </w:t>
+        <w:t xml:space="preserve"> in each state. We chose a horizontal bar chart so that each state can be compared on </w:t>
       </w:r>
       <w:r>
         <w:rPr>

</xml_diff>